<commit_message>
Apply Casanova compliance language update
</commit_message>
<xml_diff>
--- a/Casanova Money Machine Composite Fix.docx
+++ b/Casanova Money Machine Composite Fix.docx
@@ -298,6 +298,121 @@
         </w:tc>
       </w:tr>
     </w:tbl>
+    <w:p>
+      <w:pPr>
+        <w:pStyle w:val="Heading1"/>
+        <w:pBdr>
+          <w:bottom w:val="single" w:color="1A1A1A" w:sz="6" w:space="4"/>
+        </w:pBdr>
+        <w:spacing w:after="200" w:before="420"/>
+      </w:pPr>
+      <w:r>
+        <w:rPr>
+          <w:rFonts w:ascii="Georgia" w:cs="Georgia" w:eastAsia="Georgia" w:hAnsi="Georgia"/>
+          <w:b/>
+          <w:bCs/>
+          <w:color w:val="1A1A1A"/>
+          <w:sz w:val="30"/>
+          <w:szCs w:val="30"/>
+        </w:rPr>
+        <w:t xml:space="preserve">Verified Live State — Re-Checked Against the Actual Site</w:t>
+      </w:r>
+    </w:p>
+    <w:p>
+      <w:pPr>
+        <w:pStyle w:val="ListParagraph"/>
+        <w:numPr>
+          <w:ilvl w:val="0"/>
+          <w:numId w:val="2"/>
+        </w:numPr>
+        <w:spacing w:after="80" w:line="280"/>
+      </w:pPr>
+      <w:r>
+        <w:rPr>
+          <w:rFonts w:ascii="Georgia" w:cs="Georgia" w:eastAsia="Georgia" w:hAnsi="Georgia"/>
+          <w:color w:val="1A1A1A"/>
+          <w:sz w:val="21"/>
+          <w:szCs w:val="21"/>
+        </w:rPr>
+        <w:t xml:space="preserve">Hero motto is currently “Consult. Suggest. Route. Oversee. Love.” — not the “Absorb. Navigate. Restore. Love.” copy specified above. This needs to be a deliberate decision, not a drift — confirm which framework is actually going live before more content gets built around either one.</w:t>
+      </w:r>
+    </w:p>
+    <w:p>
+      <w:pPr>
+        <w:pStyle w:val="ListParagraph"/>
+        <w:numPr>
+          <w:ilvl w:val="0"/>
+          <w:numId w:val="2"/>
+        </w:numPr>
+        <w:spacing w:after="80" w:line="280"/>
+      </w:pPr>
+      <w:r>
+        <w:rPr>
+          <w:rFonts w:ascii="Georgia" w:cs="Georgia" w:eastAsia="Georgia" w:hAnsi="Georgia"/>
+          <w:color w:val="1A1A1A"/>
+          <w:sz w:val="21"/>
+          <w:szCs w:val="21"/>
+        </w:rPr>
+        <w:t xml:space="preserve">Hospital names are still live and described as “personally vetted,” including “Casanova's primary clinical partner” language for Bumrungrad — naming Bumrungrad, RAKxa, Kamalaya, Chiva-Som, Penang Adventist &amp; Prince Court, and FV Hospital &amp; Vinmec directly. This is the single highest-priority unresolved item on this entire list, confirmed still live as of this check.</w:t>
+      </w:r>
+    </w:p>
+    <w:p>
+      <w:pPr>
+        <w:pStyle w:val="ListParagraph"/>
+        <w:numPr>
+          <w:ilvl w:val="0"/>
+          <w:numId w:val="2"/>
+        </w:numPr>
+        <w:spacing w:after="80" w:line="280"/>
+      </w:pPr>
+      <w:r>
+        <w:rPr>
+          <w:rFonts w:ascii="Georgia" w:cs="Georgia" w:eastAsia="Georgia" w:hAnsi="Georgia"/>
+          <w:color w:val="1A1A1A"/>
+          <w:sz w:val="21"/>
+          <w:szCs w:val="21"/>
+        </w:rPr>
+        <w:t xml:space="preserve">Renew tier still names “CAR-NK engineered immune cells” and cultured stem cell therapy explicitly — the ATMP compliance rewrite has not been applied.</w:t>
+      </w:r>
+    </w:p>
+    <w:p>
+      <w:pPr>
+        <w:pStyle w:val="ListParagraph"/>
+        <w:numPr>
+          <w:ilvl w:val="0"/>
+          <w:numId w:val="2"/>
+        </w:numPr>
+        <w:spacing w:after="80" w:line="280"/>
+      </w:pPr>
+      <w:r>
+        <w:rPr>
+          <w:rFonts w:ascii="Georgia" w:cs="Georgia" w:eastAsia="Georgia" w:hAnsi="Georgia"/>
+          <w:color w:val="1A1A1A"/>
+          <w:sz w:val="21"/>
+          <w:szCs w:val="21"/>
+        </w:rPr>
+        <w:t xml:space="preserve">/brief.html is still mailto-only — “Launch issue one” and “Sponsor or subscribe” both route to a personal email. No Beehiiv, no Stripe, no list.</w:t>
+      </w:r>
+    </w:p>
+    <w:p>
+      <w:pPr>
+        <w:pStyle w:val="ListParagraph"/>
+        <w:numPr>
+          <w:ilvl w:val="0"/>
+          <w:numId w:val="2"/>
+        </w:numPr>
+        <w:spacing w:after="80" w:line="280"/>
+      </w:pPr>
+      <w:r>
+        <w:rPr>
+          <w:rFonts w:ascii="Georgia" w:cs="Georgia" w:eastAsia="Georgia" w:hAnsi="Georgia"/>
+          <w:color w:val="1A1A1A"/>
+          <w:sz w:val="21"/>
+          <w:szCs w:val="21"/>
+        </w:rPr>
+        <w:t xml:space="preserve">Homepage nav still doesn't link to Brief, Sponsors, Caregivers, or the new Countries page — confirmed still missing.</w:t>
+      </w:r>
+    </w:p>
     <w:p>
       <w:pPr>
         <w:pStyle w:val="Heading1"/>
@@ -1546,6 +1661,551 @@
     </w:p>
     <w:p>
       <w:pPr>
+        <w:pStyle w:val="Heading1"/>
+        <w:pBdr>
+          <w:bottom w:val="single" w:color="1A1A1A" w:sz="6" w:space="4"/>
+        </w:pBdr>
+        <w:spacing w:after="200" w:before="420"/>
+      </w:pPr>
+      <w:r>
+        <w:rPr>
+          <w:rFonts w:ascii="Georgia" w:cs="Georgia" w:eastAsia="Georgia" w:hAnsi="Georgia"/>
+          <w:b/>
+          <w:bCs/>
+          <w:color w:val="1A1A1A"/>
+          <w:sz w:val="30"/>
+          <w:szCs w:val="30"/>
+        </w:rPr>
+        <w:t xml:space="preserve">Region-by-Region B2C and B2B Sales Strategy</w:t>
+      </w:r>
+    </w:p>
+    <w:p>
+      <w:pPr>
+        <w:pStyle w:val="Heading2"/>
+        <w:spacing w:after="100" w:before="260"/>
+      </w:pPr>
+      <w:r>
+        <w:rPr>
+          <w:rFonts w:ascii="Georgia" w:cs="Georgia" w:eastAsia="Georgia" w:hAnsi="Georgia"/>
+          <w:b/>
+          <w:bCs/>
+          <w:color w:val="8B1A1A"/>
+          <w:sz w:val="23"/>
+          <w:szCs w:val="23"/>
+        </w:rPr>
+        <w:t xml:space="preserve">United States — The Demand Side</w:t>
+      </w:r>
+    </w:p>
+    <w:p>
+      <w:pPr>
+        <w:pStyle w:val="ListParagraph"/>
+        <w:numPr>
+          <w:ilvl w:val="0"/>
+          <w:numId w:val="2"/>
+        </w:numPr>
+        <w:spacing w:after="80" w:line="280"/>
+      </w:pPr>
+      <w:r>
+        <w:rPr>
+          <w:rFonts w:ascii="Georgia" w:cs="Georgia" w:eastAsia="Georgia" w:hAnsi="Georgia"/>
+          <w:color w:val="1A1A1A"/>
+          <w:sz w:val="21"/>
+          <w:szCs w:val="21"/>
+        </w:rPr>
+        <w:t xml:space="preserve">Primary channel: The Brief, once it actually collects subscribers — SEO-driven organic (Price Check terms), plus paid social targeting 55+ Americans researching longevity/regenerative therapy</w:t>
+      </w:r>
+    </w:p>
+    <w:p>
+      <w:pPr>
+        <w:pStyle w:val="ListParagraph"/>
+        <w:numPr>
+          <w:ilvl w:val="0"/>
+          <w:numId w:val="2"/>
+        </w:numPr>
+        <w:spacing w:after="80" w:line="280"/>
+      </w:pPr>
+      <w:r>
+        <w:rPr>
+          <w:rFonts w:ascii="Georgia" w:cs="Georgia" w:eastAsia="Georgia" w:hAnsi="Georgia"/>
+          <w:color w:val="1A1A1A"/>
+          <w:sz w:val="21"/>
+          <w:szCs w:val="21"/>
+        </w:rPr>
+        <w:t xml:space="preserve">Geographic concentration: Florida, California, and Texas — same states leading US concierge/DPC density, meaning the target patient and the target referral partner already cluster in the same three states</w:t>
+      </w:r>
+    </w:p>
+    <w:p>
+      <w:pPr>
+        <w:pStyle w:val="ListParagraph"/>
+        <w:numPr>
+          <w:ilvl w:val="0"/>
+          <w:numId w:val="2"/>
+        </w:numPr>
+        <w:spacing w:after="80" w:line="280"/>
+      </w:pPr>
+      <w:r>
+        <w:rPr>
+          <w:rFonts w:ascii="Georgia" w:cs="Georgia" w:eastAsia="Georgia" w:hAnsi="Georgia"/>
+          <w:color w:val="1A1A1A"/>
+          <w:sz w:val="21"/>
+          <w:szCs w:val="21"/>
+        </w:rPr>
+        <w:t xml:space="preserve">Message: legitimacy first (physician-reviewed, accredited institutions), self-respect/inclusion framing second — per the audience map, “is this real” beats every other consideration for a first-time buyer</w:t>
+      </w:r>
+    </w:p>
+    <w:p>
+      <w:pPr>
+        <w:pStyle w:val="ListParagraph"/>
+        <w:numPr>
+          <w:ilvl w:val="0"/>
+          <w:numId w:val="2"/>
+        </w:numPr>
+        <w:spacing w:after="80" w:line="280"/>
+      </w:pPr>
+      <w:r>
+        <w:rPr>
+          <w:rFonts w:ascii="Georgia" w:cs="Georgia" w:eastAsia="Georgia" w:hAnsi="Georgia"/>
+          <w:color w:val="1A1A1A"/>
+          <w:sz w:val="21"/>
+          <w:szCs w:val="21"/>
+        </w:rPr>
+        <w:t xml:space="preserve">Founding Fifty as the initial B2C conversion lever — real scarcity, visible proof, no paid acquisition spend required for the first cohort</w:t>
+      </w:r>
+    </w:p>
+    <w:p>
+      <w:pPr>
+        <w:pStyle w:val="ListParagraph"/>
+        <w:numPr>
+          <w:ilvl w:val="0"/>
+          <w:numId w:val="2"/>
+        </w:numPr>
+        <w:spacing w:after="80" w:line="280"/>
+      </w:pPr>
+      <w:r>
+        <w:rPr>
+          <w:rFonts w:ascii="Georgia" w:cs="Georgia" w:eastAsia="Georgia" w:hAnsi="Georgia"/>
+          <w:color w:val="1A1A1A"/>
+          <w:sz w:val="21"/>
+          <w:szCs w:val="21"/>
+        </w:rPr>
+        <w:t xml:space="preserve">Primary target: MDVIP (1,400+ affiliated physicians, one relationship, national reach) — approach before individual practice-by-practice outreach</w:t>
+      </w:r>
+    </w:p>
+    <w:p>
+      <w:pPr>
+        <w:pStyle w:val="ListParagraph"/>
+        <w:numPr>
+          <w:ilvl w:val="0"/>
+          <w:numId w:val="2"/>
+        </w:numPr>
+        <w:spacing w:after="80" w:line="280"/>
+      </w:pPr>
+      <w:r>
+        <w:rPr>
+          <w:rFonts w:ascii="Georgia" w:cs="Georgia" w:eastAsia="Georgia" w:hAnsi="Georgia"/>
+          <w:color w:val="1A1A1A"/>
+          <w:sz w:val="21"/>
+          <w:szCs w:val="21"/>
+        </w:rPr>
+        <w:t xml:space="preserve">Secondary target: DPC Alliance — attend or sponsor the annual DPC Summit for direct practice-owner access</w:t>
+      </w:r>
+    </w:p>
+    <w:p>
+      <w:pPr>
+        <w:pStyle w:val="ListParagraph"/>
+        <w:numPr>
+          <w:ilvl w:val="0"/>
+          <w:numId w:val="2"/>
+        </w:numPr>
+        <w:spacing w:after="80" w:line="280"/>
+      </w:pPr>
+      <w:r>
+        <w:rPr>
+          <w:rFonts w:ascii="Georgia" w:cs="Georgia" w:eastAsia="Georgia" w:hAnsi="Georgia"/>
+          <w:color w:val="1A1A1A"/>
+          <w:sz w:val="21"/>
+          <w:szCs w:val="21"/>
+        </w:rPr>
+        <w:t xml:space="preserve">Tertiary: targeted outreach into the NextMD.ai directory, filtered to Florida, California, and Texas practices first</w:t>
+      </w:r>
+    </w:p>
+    <w:p>
+      <w:pPr>
+        <w:pStyle w:val="ListParagraph"/>
+        <w:numPr>
+          <w:ilvl w:val="0"/>
+          <w:numId w:val="2"/>
+        </w:numPr>
+        <w:spacing w:after="80" w:line="280"/>
+      </w:pPr>
+      <w:r>
+        <w:rPr>
+          <w:rFonts w:ascii="Georgia" w:cs="Georgia" w:eastAsia="Georgia" w:hAnsi="Georgia"/>
+          <w:color w:val="1A1A1A"/>
+          <w:sz w:val="21"/>
+          <w:szCs w:val="21"/>
+        </w:rPr>
+        <w:t xml:space="preserve">Message to B2B: revenue share without infrastructure build-out, physician-reviewed intake removes liability concern, de-identified outcomes data as a value-add for their own patient marketing</w:t>
+      </w:r>
+    </w:p>
+    <w:p>
+      <w:pPr>
+        <w:pStyle w:val="Heading2"/>
+        <w:spacing w:after="100" w:before="260"/>
+      </w:pPr>
+      <w:r>
+        <w:rPr>
+          <w:rFonts w:ascii="Georgia" w:cs="Georgia" w:eastAsia="Georgia" w:hAnsi="Georgia"/>
+          <w:b/>
+          <w:bCs/>
+          <w:color w:val="8B1A1A"/>
+          <w:sz w:val="23"/>
+          <w:szCs w:val="23"/>
+        </w:rPr>
+        <w:t xml:space="preserve">Thailand — The Anchor Market</w:t>
+      </w:r>
+    </w:p>
+    <w:p>
+      <w:pPr>
+        <w:pStyle w:val="ListParagraph"/>
+        <w:numPr>
+          <w:ilvl w:val="0"/>
+          <w:numId w:val="2"/>
+        </w:numPr>
+        <w:spacing w:after="80" w:line="280"/>
+      </w:pPr>
+      <w:r>
+        <w:rPr>
+          <w:rFonts w:ascii="Georgia" w:cs="Georgia" w:eastAsia="Georgia" w:hAnsi="Georgia"/>
+          <w:color w:val="1A1A1A"/>
+          <w:sz w:val="21"/>
+          <w:szCs w:val="21"/>
+        </w:rPr>
+        <w:t xml:space="preserve">Primary audience: the frustrated American — legitimacy-first messaging anchored on Bumrungrad-caliber credibility once that relationship is actually signed</w:t>
+      </w:r>
+    </w:p>
+    <w:p>
+      <w:pPr>
+        <w:pStyle w:val="ListParagraph"/>
+        <w:numPr>
+          <w:ilvl w:val="0"/>
+          <w:numId w:val="2"/>
+        </w:numPr>
+        <w:spacing w:after="80" w:line="280"/>
+      </w:pPr>
+      <w:r>
+        <w:rPr>
+          <w:rFonts w:ascii="Georgia" w:cs="Georgia" w:eastAsia="Georgia" w:hAnsi="Georgia"/>
+          <w:color w:val="1A1A1A"/>
+          <w:sz w:val="21"/>
+          <w:szCs w:val="21"/>
+        </w:rPr>
+        <w:t xml:space="preserve">Secondary, smaller audience: Thai-based expats and long-tenure residents — reached through the Ambassador channel (InterNations Bangkok, AmCham, BCCT) rather than paid acquisition</w:t>
+      </w:r>
+    </w:p>
+    <w:p>
+      <w:pPr>
+        <w:pStyle w:val="ListParagraph"/>
+        <w:numPr>
+          <w:ilvl w:val="0"/>
+          <w:numId w:val="2"/>
+        </w:numPr>
+        <w:spacing w:after="80" w:line="280"/>
+      </w:pPr>
+      <w:r>
+        <w:rPr>
+          <w:rFonts w:ascii="Georgia" w:cs="Georgia" w:eastAsia="Georgia" w:hAnsi="Georgia"/>
+          <w:color w:val="1A1A1A"/>
+          <w:sz w:val="21"/>
+          <w:szCs w:val="21"/>
+        </w:rPr>
+        <w:t xml:space="preserve">Government tailwind to cite directly in outreach: Thailand's 2026 “Golden Year of Healthcare” campaign and TAT's “Healing Is the New Luxury” positioning — use this to open conversations, not just as background context</w:t>
+      </w:r>
+    </w:p>
+    <w:p>
+      <w:pPr>
+        <w:pStyle w:val="ListParagraph"/>
+        <w:numPr>
+          <w:ilvl w:val="0"/>
+          <w:numId w:val="2"/>
+        </w:numPr>
+        <w:spacing w:after="80" w:line="280"/>
+      </w:pPr>
+      <w:r>
+        <w:rPr>
+          <w:rFonts w:ascii="Georgia" w:cs="Georgia" w:eastAsia="Georgia" w:hAnsi="Georgia"/>
+          <w:color w:val="1A1A1A"/>
+          <w:sz w:val="21"/>
+          <w:szCs w:val="21"/>
+        </w:rPr>
+        <w:t xml:space="preserve">Priority outreach: Medeze (single relationship covers Bangkok and Ho Chi Minh City), then Bumrungrad VitalLife, then the mid-tier longevity specialists (Healthi Life, Miracle Regenerative Center)</w:t>
+      </w:r>
+    </w:p>
+    <w:p>
+      <w:pPr>
+        <w:pStyle w:val="Heading2"/>
+        <w:spacing w:after="100" w:before="260"/>
+      </w:pPr>
+      <w:r>
+        <w:rPr>
+          <w:rFonts w:ascii="Georgia" w:cs="Georgia" w:eastAsia="Georgia" w:hAnsi="Georgia"/>
+          <w:b/>
+          <w:bCs/>
+          <w:color w:val="8B1A1A"/>
+          <w:sz w:val="23"/>
+          <w:szCs w:val="23"/>
+        </w:rPr>
+        <w:t xml:space="preserve">Malaysia — The Institutional Leverage Play</w:t>
+      </w:r>
+    </w:p>
+    <w:p>
+      <w:pPr>
+        <w:pStyle w:val="ListParagraph"/>
+        <w:numPr>
+          <w:ilvl w:val="0"/>
+          <w:numId w:val="2"/>
+        </w:numPr>
+        <w:spacing w:after="80" w:line="280"/>
+      </w:pPr>
+      <w:r>
+        <w:rPr>
+          <w:rFonts w:ascii="Georgia" w:cs="Georgia" w:eastAsia="Georgia" w:hAnsi="Georgia"/>
+          <w:color w:val="1A1A1A"/>
+          <w:sz w:val="21"/>
+          <w:szCs w:val="21"/>
+        </w:rPr>
+        <w:t xml:space="preserve">Core audience remains the same American 55+ buyer, routed to Malaysia when Thailand availability or specific protocol fit points there instead</w:t>
+      </w:r>
+    </w:p>
+    <w:p>
+      <w:pPr>
+        <w:pStyle w:val="ListParagraph"/>
+        <w:numPr>
+          <w:ilvl w:val="0"/>
+          <w:numId w:val="2"/>
+        </w:numPr>
+        <w:spacing w:after="80" w:line="280"/>
+      </w:pPr>
+      <w:r>
+        <w:rPr>
+          <w:rFonts w:ascii="Georgia" w:cs="Georgia" w:eastAsia="Georgia" w:hAnsi="Georgia"/>
+          <w:color w:val="1A1A1A"/>
+          <w:sz w:val="21"/>
+          <w:szCs w:val="21"/>
+        </w:rPr>
+        <w:t xml:space="preserve">A real, distinct secondary audience worth naming honestly: Singapore-based patients already crossing into Malaysia for lower-cost stem cell and regenerative therapy — a genuine, currently underserved segment, and a natural extension of the inclusive positioning already adopted. Worth a deliberate decision, not an assumption, on whether to pursue this segment now or note it for later.</w:t>
+      </w:r>
+    </w:p>
+    <w:p>
+      <w:pPr>
+        <w:pStyle w:val="ListParagraph"/>
+        <w:numPr>
+          <w:ilvl w:val="0"/>
+          <w:numId w:val="2"/>
+        </w:numPr>
+        <w:spacing w:after="80" w:line="280"/>
+      </w:pPr>
+      <w:r>
+        <w:rPr>
+          <w:rFonts w:ascii="Georgia" w:cs="Georgia" w:eastAsia="Georgia" w:hAnsi="Georgia"/>
+          <w:color w:val="1A1A1A"/>
+          <w:sz w:val="21"/>
+          <w:szCs w:val="21"/>
+        </w:rPr>
+        <w:t xml:space="preserve">Malaysia's Muslim-friendly healthcare ecosystem is a real, government-supported differentiator — relevant if pursuing any Middle East or Southeast Asian Muslim patient segment, consistent with the “for every person” framing</w:t>
+      </w:r>
+    </w:p>
+    <w:p>
+      <w:pPr>
+        <w:pStyle w:val="ListParagraph"/>
+        <w:numPr>
+          <w:ilvl w:val="0"/>
+          <w:numId w:val="2"/>
+        </w:numPr>
+        <w:spacing w:after="80" w:line="280"/>
+      </w:pPr>
+      <w:r>
+        <w:rPr>
+          <w:rFonts w:ascii="Georgia" w:cs="Georgia" w:eastAsia="Georgia" w:hAnsi="Georgia"/>
+          <w:color w:val="1A1A1A"/>
+          <w:sz w:val="21"/>
+          <w:szCs w:val="21"/>
+        </w:rPr>
+        <w:t xml:space="preserve">Priority target: MHTC (Malaysia Healthcare Travel Council) — one government relationship, 80 member hospitals, same single-door leverage logic as MDVIP in the US and Subedi in Nepal</w:t>
+      </w:r>
+    </w:p>
+    <w:p>
+      <w:pPr>
+        <w:pStyle w:val="ListParagraph"/>
+        <w:numPr>
+          <w:ilvl w:val="0"/>
+          <w:numId w:val="2"/>
+        </w:numPr>
+        <w:spacing w:after="80" w:line="280"/>
+      </w:pPr>
+      <w:r>
+        <w:rPr>
+          <w:rFonts w:ascii="Georgia" w:cs="Georgia" w:eastAsia="Georgia" w:hAnsi="Georgia"/>
+          <w:color w:val="1A1A1A"/>
+          <w:sz w:val="21"/>
+          <w:szCs w:val="21"/>
+        </w:rPr>
+        <w:t xml:space="preserve">Secondary: the Flagship Medical Tourism Hospital shortlist (Institut Jantung Negara, Island Hospital Penang, Mahkota Medical Centre, Subang Jaya Medical Centre) — government-vetted credibility built in</w:t>
+      </w:r>
+    </w:p>
+    <w:p>
+      <w:pPr>
+        <w:pStyle w:val="ListParagraph"/>
+        <w:numPr>
+          <w:ilvl w:val="0"/>
+          <w:numId w:val="2"/>
+        </w:numPr>
+        <w:spacing w:after="80" w:line="280"/>
+      </w:pPr>
+      <w:r>
+        <w:rPr>
+          <w:rFonts w:ascii="Georgia" w:cs="Georgia" w:eastAsia="Georgia" w:hAnsi="Georgia"/>
+          <w:color w:val="1A1A1A"/>
+          <w:sz w:val="21"/>
+          <w:szCs w:val="21"/>
+        </w:rPr>
+        <w:t xml:space="preserve">Cite the national “Malaysia Year of Medical Tourism 2026” campaign directly in outreach — this is an active government sales motion you can align with, not compete against</w:t>
+      </w:r>
+    </w:p>
+    <w:p>
+      <w:pPr>
+        <w:pStyle w:val="Heading2"/>
+        <w:spacing w:after="100" w:before="260"/>
+      </w:pPr>
+      <w:r>
+        <w:rPr>
+          <w:rFonts w:ascii="Georgia" w:cs="Georgia" w:eastAsia="Georgia" w:hAnsi="Georgia"/>
+          <w:b/>
+          <w:bCs/>
+          <w:color w:val="8B1A1A"/>
+          <w:sz w:val="23"/>
+          <w:szCs w:val="23"/>
+        </w:rPr>
+        <w:t xml:space="preserve">Vietnam — The Emerging-Value Market</w:t>
+      </w:r>
+    </w:p>
+    <w:p>
+      <w:pPr>
+        <w:pStyle w:val="ListParagraph"/>
+        <w:numPr>
+          <w:ilvl w:val="0"/>
+          <w:numId w:val="2"/>
+        </w:numPr>
+        <w:spacing w:after="80" w:line="280"/>
+      </w:pPr>
+      <w:r>
+        <w:rPr>
+          <w:rFonts w:ascii="Georgia" w:cs="Georgia" w:eastAsia="Georgia" w:hAnsi="Georgia"/>
+          <w:color w:val="1A1A1A"/>
+          <w:sz w:val="21"/>
+          <w:szCs w:val="21"/>
+        </w:rPr>
+        <w:t xml:space="preserve">Positioned honestly as the value-oriented option within the three-country map, not the flagship destination — useful for price-sensitive segments of the same core American 55+ audience</w:t>
+      </w:r>
+    </w:p>
+    <w:p>
+      <w:pPr>
+        <w:pStyle w:val="ListParagraph"/>
+        <w:numPr>
+          <w:ilvl w:val="0"/>
+          <w:numId w:val="2"/>
+        </w:numPr>
+        <w:spacing w:after="80" w:line="280"/>
+      </w:pPr>
+      <w:r>
+        <w:rPr>
+          <w:rFonts w:ascii="Georgia" w:cs="Georgia" w:eastAsia="Georgia" w:hAnsi="Georgia"/>
+          <w:color w:val="1A1A1A"/>
+          <w:sz w:val="21"/>
+          <w:szCs w:val="21"/>
+        </w:rPr>
+        <w:t xml:space="preserve">Vietnamese diaspora in the US is a plausible longer-term Ambassador/Creator audience, parallel to the Nepali/Burmese diaspora channel already built for Thailand — not urgent, but worth keeping on the roadmap</w:t>
+      </w:r>
+    </w:p>
+    <w:p>
+      <w:pPr>
+        <w:pStyle w:val="ListParagraph"/>
+        <w:numPr>
+          <w:ilvl w:val="0"/>
+          <w:numId w:val="2"/>
+        </w:numPr>
+        <w:spacing w:after="80" w:line="280"/>
+      </w:pPr>
+      <w:r>
+        <w:rPr>
+          <w:rFonts w:ascii="Georgia" w:cs="Georgia" w:eastAsia="Georgia" w:hAnsi="Georgia"/>
+          <w:color w:val="1A1A1A"/>
+          <w:sz w:val="21"/>
+          <w:szCs w:val="21"/>
+        </w:rPr>
+        <w:t xml:space="preserve">Priority target: Medeze (shared relationship with the Bangkok entity, fastest to close)</w:t>
+      </w:r>
+    </w:p>
+    <w:p>
+      <w:pPr>
+        <w:pStyle w:val="ListParagraph"/>
+        <w:numPr>
+          <w:ilvl w:val="0"/>
+          <w:numId w:val="2"/>
+        </w:numPr>
+        <w:spacing w:after="80" w:line="280"/>
+      </w:pPr>
+      <w:r>
+        <w:rPr>
+          <w:rFonts w:ascii="Georgia" w:cs="Georgia" w:eastAsia="Georgia" w:hAnsi="Georgia"/>
+          <w:color w:val="1A1A1A"/>
+          <w:sz w:val="21"/>
+          <w:szCs w:val="21"/>
+        </w:rPr>
+        <w:t xml:space="preserve">Secondary: Vinmec, on the strength of its dedicated Research Institute of Stem Cells and Gene Technology — the strongest scientific credibility signal available in-country, worth leading with in any pitch</w:t>
+      </w:r>
+    </w:p>
+    <w:p>
+      <w:pPr>
+        <w:pStyle w:val="ListParagraph"/>
+        <w:numPr>
+          <w:ilvl w:val="0"/>
+          <w:numId w:val="2"/>
+        </w:numPr>
+        <w:spacing w:after="80" w:line="280"/>
+      </w:pPr>
+      <w:r>
+        <w:rPr>
+          <w:rFonts w:ascii="Georgia" w:cs="Georgia" w:eastAsia="Georgia" w:hAnsi="Georgia"/>
+          <w:color w:val="1A1A1A"/>
+          <w:sz w:val="21"/>
+          <w:szCs w:val="21"/>
+        </w:rPr>
+        <w:t xml:space="preserve">FV Hospital as a third target once bandwidth allows — JCI-accredited with active regenerative and multilingual services</w:t>
+      </w:r>
+    </w:p>
+    <w:p>
+      <w:pPr>
+        <w:pStyle w:val="Heading1"/>
+        <w:pBdr>
+          <w:bottom w:val="single" w:color="1A1A1A" w:sz="6" w:space="4"/>
+        </w:pBdr>
+        <w:spacing w:after="200" w:before="420"/>
+      </w:pPr>
+      <w:r>
+        <w:rPr>
+          <w:rFonts w:ascii="Georgia" w:cs="Georgia" w:eastAsia="Georgia" w:hAnsi="Georgia"/>
+          <w:b/>
+          <w:bCs/>
+          <w:color w:val="1A1A1A"/>
+          <w:sz w:val="30"/>
+          <w:szCs w:val="30"/>
+        </w:rPr>
+        <w:t xml:space="preserve">Build Sequence</w:t>
+      </w:r>
+    </w:p>
+    <w:p>
+      <w:pPr>
         <w:pStyle w:val="ListParagraph"/>
         <w:numPr>
           <w:ilvl w:val="0"/>
@@ -1694,6 +2354,25 @@
           <w:szCs w:val="21"/>
         </w:rPr>
         <w:t xml:space="preserve">Ongoing: SEO basics (#6, #10) — low effort, do in parallel with everything else, not after</w:t>
+      </w:r>
+    </w:p>
+    <w:p>
+      <w:pPr>
+        <w:pStyle w:val="ListParagraph"/>
+        <w:numPr>
+          <w:ilvl w:val="0"/>
+          <w:numId w:val="2"/>
+        </w:numPr>
+        <w:spacing w:after="80" w:line="280"/>
+      </w:pPr>
+      <w:r>
+        <w:rPr>
+          <w:rFonts w:ascii="Georgia" w:cs="Georgia" w:eastAsia="Georgia" w:hAnsi="Georgia"/>
+          <w:color w:val="1A1A1A"/>
+          <w:sz w:val="21"/>
+          <w:szCs w:val="21"/>
+        </w:rPr>
+        <w:t xml:space="preserve">Parallel track: MDVIP and Medeze outreach (region-by-region strategy above) — BD conversations don't block on site fixes, run both simultaneously</w:t>
       </w:r>
     </w:p>
     <w:p>

</xml_diff>

<commit_message>
Apply Casanova newsletter and pathway fixes
</commit_message>
<xml_diff>
--- a/Casanova Money Machine Composite Fix.docx
+++ b/Casanova Money Machine Composite Fix.docx
@@ -315,7 +315,219 @@
           <w:sz w:val="30"/>
           <w:szCs w:val="30"/>
         </w:rPr>
-        <w:t xml:space="preserve">Verified Live State — Re-Checked Against the Actual Site</w:t>
+        <w:t xml:space="preserve">Latest Nitpick Pass — Homepage, Countries, Brief</w:t>
+      </w:r>
+    </w:p>
+    <w:p>
+      <w:pPr>
+        <w:pStyle w:val="Heading2"/>
+        <w:spacing w:after="100" w:before="260"/>
+      </w:pPr>
+      <w:r>
+        <w:rPr>
+          <w:rFonts w:ascii="Georgia" w:cs="Georgia" w:eastAsia="Georgia" w:hAnsi="Georgia"/>
+          <w:b/>
+          <w:bCs/>
+          <w:color w:val="8B1A1A"/>
+          <w:sz w:val="23"/>
+          <w:szCs w:val="23"/>
+        </w:rPr>
+        <w:t xml:space="preserve">Homepage</w:t>
+      </w:r>
+    </w:p>
+    <w:p>
+      <w:pPr>
+        <w:pStyle w:val="ListParagraph"/>
+        <w:numPr>
+          <w:ilvl w:val="0"/>
+          <w:numId w:val="2"/>
+        </w:numPr>
+        <w:spacing w:after="80" w:line="280"/>
+      </w:pPr>
+      <w:r>
+        <w:rPr>
+          <w:rFonts w:ascii="Georgia" w:cs="Georgia" w:eastAsia="Georgia" w:hAnsi="Georgia"/>
+          <w:color w:val="1A1A1A"/>
+          <w:sz w:val="21"/>
+          <w:szCs w:val="21"/>
+        </w:rPr>
+        <w:t xml:space="preserve">Nav is complete — every page links correctly. No dead links found.</w:t>
+      </w:r>
+    </w:p>
+    <w:p>
+      <w:pPr>
+        <w:pStyle w:val="ListParagraph"/>
+        <w:numPr>
+          <w:ilvl w:val="0"/>
+          <w:numId w:val="2"/>
+        </w:numPr>
+        <w:spacing w:after="80" w:line="280"/>
+      </w:pPr>
+      <w:r>
+        <w:rPr>
+          <w:rFonts w:ascii="Georgia" w:cs="Georgia" w:eastAsia="Georgia" w:hAnsi="Georgia"/>
+          <w:color w:val="1A1A1A"/>
+          <w:sz w:val="21"/>
+          <w:szCs w:val="21"/>
+        </w:rPr>
+        <w:t xml:space="preserve">Wellness Partner Network section is now internally inconsistent with the site's own Countries page: Thailand uses honest pathway language, but Malaysia and Vietnam still say “Personally vetted” and name Penang Adventist &amp; Prince Court and FV Hospital &amp; Vinmec directly — while /countries.html, one click away, explicitly says Casanova does not promise a fixed placement before intake. Fix below.</w:t>
+      </w:r>
+    </w:p>
+    <w:p>
+      <w:pPr>
+        <w:pStyle w:val="ListParagraph"/>
+        <w:numPr>
+          <w:ilvl w:val="0"/>
+          <w:numId w:val="2"/>
+        </w:numPr>
+        <w:spacing w:after="80" w:line="280"/>
+      </w:pPr>
+      <w:r>
+        <w:rPr>
+          <w:rFonts w:ascii="Georgia" w:cs="Georgia" w:eastAsia="Georgia" w:hAnsi="Georgia"/>
+          <w:color w:val="1A1A1A"/>
+          <w:sz w:val="21"/>
+          <w:szCs w:val="21"/>
+        </w:rPr>
+        <w:t xml:space="preserve">Renew tier still names CAR-NK and cultured stem cell therapy explicitly — unchanged across every check to date.</w:t>
+      </w:r>
+    </w:p>
+    <w:p>
+      <w:pPr>
+        <w:pStyle w:val="ListParagraph"/>
+        <w:numPr>
+          <w:ilvl w:val="0"/>
+          <w:numId w:val="2"/>
+        </w:numPr>
+        <w:spacing w:after="80" w:line="280"/>
+      </w:pPr>
+      <w:r>
+        <w:rPr>
+          <w:rFonts w:ascii="Georgia" w:cs="Georgia" w:eastAsia="Georgia" w:hAnsi="Georgia"/>
+          <w:color w:val="1A1A1A"/>
+          <w:sz w:val="21"/>
+          <w:szCs w:val="21"/>
+        </w:rPr>
+        <w:t xml:space="preserve">EBOO/ozone therapy is listed as included with no caution language — same category of issue as exosomes/NAD+, not yet separately addressed.</w:t>
+      </w:r>
+    </w:p>
+    <w:p>
+      <w:pPr>
+        <w:pStyle w:val="ListParagraph"/>
+        <w:numPr>
+          <w:ilvl w:val="0"/>
+          <w:numId w:val="2"/>
+        </w:numPr>
+        <w:spacing w:after="80" w:line="280"/>
+      </w:pPr>
+      <w:r>
+        <w:rPr>
+          <w:rFonts w:ascii="Georgia" w:cs="Georgia" w:eastAsia="Georgia" w:hAnsi="Georgia"/>
+          <w:color w:val="1A1A1A"/>
+          <w:sz w:val="21"/>
+          <w:szCs w:val="21"/>
+        </w:rPr>
+        <w:t xml:space="preserve">Footer disclaimer is general (CPP and outcomes language) but still doesn't contain the two adopted licensing-dependency paragraphs.</w:t>
+      </w:r>
+    </w:p>
+    <w:p>
+      <w:pPr>
+        <w:spacing w:after="40"/>
+      </w:pPr>
+      <w:r>
+        <w:rPr>
+          <w:rFonts w:ascii="Courier New" w:cs="Courier New" w:eastAsia="Courier New" w:hAnsi="Courier New"/>
+          <w:b/>
+          <w:bCs/>
+          <w:color w:val="AA3333"/>
+          <w:sz w:val="16"/>
+          <w:szCs w:val="16"/>
+        </w:rPr>
+        <w:t xml:space="preserve">BEFORE</w:t>
+      </w:r>
+    </w:p>
+    <w:p>
+      <w:pPr>
+        <w:shd w:fill="F7EAEA" w:val="clear"/>
+        <w:spacing w:after="100"/>
+      </w:pPr>
+      <w:r>
+        <w:rPr>
+          <w:rFonts w:ascii="Georgia" w:cs="Georgia" w:eastAsia="Georgia" w:hAnsi="Georgia"/>
+          <w:strike/>
+          <w:color w:val="1A1A1A"/>
+          <w:sz w:val="20"/>
+          <w:szCs w:val="20"/>
+        </w:rPr>
+        <w:t xml:space="preserve">Malaysia: Penang Adventist &amp; Prince Court — Personally vetted.
+Vietnam: FV Hospital &amp; Vinmec — Personally vetted.</w:t>
+      </w:r>
+    </w:p>
+    <w:p>
+      <w:pPr>
+        <w:spacing w:after="40"/>
+      </w:pPr>
+      <w:r>
+        <w:rPr>
+          <w:rFonts w:ascii="Courier New" w:cs="Courier New" w:eastAsia="Courier New" w:hAnsi="Courier New"/>
+          <w:b/>
+          <w:bCs/>
+          <w:color w:val="2E7D32"/>
+          <w:sz w:val="16"/>
+          <w:szCs w:val="16"/>
+        </w:rPr>
+        <w:t xml:space="preserve">AFTER</w:t>
+      </w:r>
+    </w:p>
+    <w:p>
+      <w:pPr>
+        <w:shd w:fill="EAF5EA" w:val="clear"/>
+        <w:spacing w:after="160"/>
+      </w:pPr>
+      <w:r>
+        <w:rPr>
+          <w:rFonts w:ascii="Georgia" w:cs="Georgia" w:eastAsia="Georgia" w:hAnsi="Georgia"/>
+          <w:color w:val="1A1A1A"/>
+          <w:sz w:val="20"/>
+          <w:szCs w:val="20"/>
+        </w:rPr>
+        <w:t xml:space="preserve">Malaysia: Regional specialist pathway — candidate institutions under review.
+Vietnam: Regional recovery pathway — candidate institutions under review.
+(Match the Thailand section's exact pathway phrasing and tone — don't introduce a third style.)</w:t>
+      </w:r>
+    </w:p>
+    <w:p>
+      <w:pPr>
+        <w:pStyle w:val="Heading2"/>
+        <w:spacing w:after="100" w:before="260"/>
+      </w:pPr>
+      <w:r>
+        <w:rPr>
+          <w:rFonts w:ascii="Georgia" w:cs="Georgia" w:eastAsia="Georgia" w:hAnsi="Georgia"/>
+          <w:b/>
+          <w:bCs/>
+          <w:color w:val="8B1A1A"/>
+          <w:sz w:val="23"/>
+          <w:szCs w:val="23"/>
+        </w:rPr>
+        <w:t xml:space="preserve">/countries.html</w:t>
+      </w:r>
+    </w:p>
+    <w:p>
+      <w:pPr>
+        <w:pStyle w:val="Heading2"/>
+        <w:spacing w:after="100" w:before="260"/>
+      </w:pPr>
+      <w:r>
+        <w:rPr>
+          <w:rFonts w:ascii="Georgia" w:cs="Georgia" w:eastAsia="Georgia" w:hAnsi="Georgia"/>
+          <w:b/>
+          <w:bCs/>
+          <w:color w:val="8B1A1A"/>
+          <w:sz w:val="23"/>
+          <w:szCs w:val="23"/>
+        </w:rPr>
+        <w:t xml:space="preserve">/brief.html — the real “buttons don't work” finding</w:t>
       </w:r>
     </w:p>
     <w:p>
@@ -1618,45 +1830,7 @@
           <w:sz w:val="30"/>
           <w:szCs w:val="30"/>
         </w:rPr>
-        <w:t xml:space="preserve">Two Open Decisions — Not Ashik's Call, Need Sonny First</w:t>
-      </w:r>
-    </w:p>
-    <w:p>
-      <w:pPr>
-        <w:pStyle w:val="ListParagraph"/>
-        <w:numPr>
-          <w:ilvl w:val="0"/>
-          <w:numId w:val="2"/>
-        </w:numPr>
-        <w:spacing w:after="80" w:line="280"/>
-      </w:pPr>
-      <w:r>
-        <w:rPr>
-          <w:rFonts w:ascii="Georgia" w:cs="Georgia" w:eastAsia="Georgia" w:hAnsi="Georgia"/>
-          <w:color w:val="1A1A1A"/>
-          <w:sz w:val="21"/>
-          <w:szCs w:val="21"/>
-        </w:rPr>
-        <w:t xml:space="preserve">Name consistency — “Casanova Medical,” “Casanova Medicals,” and the live domain casanovamed.com currently don't match across documents. Pick one before more content gets built around any of them.</w:t>
-      </w:r>
-    </w:p>
-    <w:p>
-      <w:pPr>
-        <w:pStyle w:val="ListParagraph"/>
-        <w:numPr>
-          <w:ilvl w:val="0"/>
-          <w:numId w:val="2"/>
-        </w:numPr>
-        <w:spacing w:after="80" w:line="280"/>
-      </w:pPr>
-      <w:r>
-        <w:rPr>
-          <w:rFonts w:ascii="Georgia" w:cs="Georgia" w:eastAsia="Georgia" w:hAnsi="Georgia"/>
-          <w:color w:val="1A1A1A"/>
-          <w:sz w:val="21"/>
-          <w:szCs w:val="21"/>
-        </w:rPr>
-        <w:t xml:space="preserve">Pricing consistency — a separate draft proposes $5,900 / $12,500 / $24,500 coordination fees, which don't match the CIN brief's investor-facing $4,500 / $9,500 / $18,500. If pricing is genuinely changing, the CIN brief needs a v4 update too — investors and the site can't show different numbers.</w:t>
+        <w:t xml:space="preserve">Naming — Resolved</w:t>
       </w:r>
     </w:p>
     <w:p>

</xml_diff>